<commit_message>
docs: 实训报告环境表补充 IntelliJ IDEA / VS Code 开发工具
</commit_message>
<xml_diff>
--- a/docs/信息化系统开发与应用实训报告-刘中天-20231026120.docx
+++ b/docs/信息化系统开发与应用实训报告-刘中天-20231026120.docx
@@ -33,7 +33,7 @@
           <w:szCs w:val="44"/>
         </w:rPr>
         <w:drawing>
-          <wp:anchor distT="0" distB="0" distL="114300" distR="114300" simplePos="0" relativeHeight="251660288" behindDoc="0" locked="0" layoutInCell="1" allowOverlap="1" wp14:anchorId="0ADB5860" wp14:editId="1BDA1625">
+          <wp:anchor distT="0" distB="0" distL="114300" distR="114300" simplePos="0" relativeHeight="251660288" behindDoc="0" locked="0" layoutInCell="1" allowOverlap="1" wp14:anchorId="77401390" wp14:editId="703B6303">
             <wp:simplePos x="0" y="0"/>
             <wp:positionH relativeFrom="column">
               <wp:posOffset>934085</wp:posOffset>
@@ -86,7 +86,7 @@
           <w:szCs w:val="44"/>
         </w:rPr>
         <w:drawing>
-          <wp:anchor distT="0" distB="0" distL="114300" distR="114300" simplePos="0" relativeHeight="251659264" behindDoc="0" locked="0" layoutInCell="1" allowOverlap="1" wp14:anchorId="189056EC" wp14:editId="7463482A">
+          <wp:anchor distT="0" distB="0" distL="114300" distR="114300" simplePos="0" relativeHeight="251659264" behindDoc="0" locked="0" layoutInCell="1" allowOverlap="1" wp14:anchorId="315252EA" wp14:editId="3E43B958">
             <wp:simplePos x="0" y="0"/>
             <wp:positionH relativeFrom="column">
               <wp:posOffset>-133985</wp:posOffset>
@@ -452,7 +452,7 @@
           <w:noProof/>
           <w:webHidden/>
         </w:rPr>
-        <w:instrText>PAGEREF _Toc243685216 \h</w:instrText>
+        <w:instrText>PAGEREF _Toc243685755 \h</w:instrText>
       </w:r>
       <w:r>
         <w:rPr>
@@ -545,7 +545,7 @@
           <w:noProof/>
           <w:webHidden/>
         </w:rPr>
-        <w:instrText>PAGEREF _Toc243685217 \h</w:instrText>
+        <w:instrText>PAGEREF _Toc243685756 \h</w:instrText>
       </w:r>
       <w:r>
         <w:rPr>
@@ -638,7 +638,7 @@
           <w:noProof/>
           <w:webHidden/>
         </w:rPr>
-        <w:instrText>PAGEREF _Toc243685218 \h</w:instrText>
+        <w:instrText>PAGEREF _Toc243685757 \h</w:instrText>
       </w:r>
       <w:r>
         <w:rPr>
@@ -731,7 +731,7 @@
           <w:noProof/>
           <w:webHidden/>
         </w:rPr>
-        <w:instrText>PAGEREF _Toc243685219 \h</w:instrText>
+        <w:instrText>PAGEREF _Toc243685758 \h</w:instrText>
       </w:r>
       <w:r>
         <w:rPr>
@@ -823,7 +823,7 @@
           <w:noProof/>
           <w:webHidden/>
         </w:rPr>
-        <w:instrText>PAGEREF _Toc243685220 \h</w:instrText>
+        <w:instrText>PAGEREF _Toc243685759 \h</w:instrText>
       </w:r>
       <w:r>
         <w:rPr>
@@ -916,7 +916,7 @@
           <w:noProof/>
           <w:webHidden/>
         </w:rPr>
-        <w:instrText>PAGEREF _Toc243685221 \h</w:instrText>
+        <w:instrText>PAGEREF _Toc243685760 \h</w:instrText>
       </w:r>
       <w:r>
         <w:rPr>
@@ -1009,7 +1009,7 @@
           <w:noProof/>
           <w:webHidden/>
         </w:rPr>
-        <w:instrText>PAGEREF _Toc243685222 \h</w:instrText>
+        <w:instrText>PAGEREF _Toc243685761 \h</w:instrText>
       </w:r>
       <w:r>
         <w:rPr>
@@ -1102,7 +1102,7 @@
           <w:noProof/>
           <w:webHidden/>
         </w:rPr>
-        <w:instrText>PAGEREF _Toc243685223 \h</w:instrText>
+        <w:instrText>PAGEREF _Toc243685762 \h</w:instrText>
       </w:r>
       <w:r>
         <w:rPr>
@@ -1194,7 +1194,7 @@
           <w:noProof/>
           <w:webHidden/>
         </w:rPr>
-        <w:instrText>PAGEREF _Toc243685224 \h</w:instrText>
+        <w:instrText>PAGEREF _Toc243685763 \h</w:instrText>
       </w:r>
       <w:r>
         <w:rPr>
@@ -1287,7 +1287,7 @@
           <w:noProof/>
           <w:webHidden/>
         </w:rPr>
-        <w:instrText>PAGEREF _Toc243685225 \h</w:instrText>
+        <w:instrText>PAGEREF _Toc243685764 \h</w:instrText>
       </w:r>
       <w:r>
         <w:rPr>
@@ -1380,7 +1380,7 @@
           <w:noProof/>
           <w:webHidden/>
         </w:rPr>
-        <w:instrText>PAGEREF _Toc243685226 \h</w:instrText>
+        <w:instrText>PAGEREF _Toc243685765 \h</w:instrText>
       </w:r>
       <w:r>
         <w:rPr>
@@ -1473,7 +1473,7 @@
           <w:noProof/>
           <w:webHidden/>
         </w:rPr>
-        <w:instrText>PAGEREF _Toc243685227 \h</w:instrText>
+        <w:instrText>PAGEREF _Toc243685766 \h</w:instrText>
       </w:r>
       <w:r>
         <w:rPr>
@@ -1566,7 +1566,7 @@
           <w:noProof/>
           <w:webHidden/>
         </w:rPr>
-        <w:instrText>PAGEREF _Toc243685228 \h</w:instrText>
+        <w:instrText>PAGEREF _Toc243685767 \h</w:instrText>
       </w:r>
       <w:r>
         <w:rPr>
@@ -1658,7 +1658,7 @@
           <w:noProof/>
           <w:webHidden/>
         </w:rPr>
-        <w:instrText>PAGEREF _Toc243685229 \h</w:instrText>
+        <w:instrText>PAGEREF _Toc243685768 \h</w:instrText>
       </w:r>
       <w:r>
         <w:rPr>
@@ -1751,7 +1751,7 @@
           <w:noProof/>
           <w:webHidden/>
         </w:rPr>
-        <w:instrText>PAGEREF _Toc243685230 \h</w:instrText>
+        <w:instrText>PAGEREF _Toc243685769 \h</w:instrText>
       </w:r>
       <w:r>
         <w:rPr>
@@ -1844,7 +1844,7 @@
           <w:noProof/>
           <w:webHidden/>
         </w:rPr>
-        <w:instrText>PAGEREF _Toc243685231 \h</w:instrText>
+        <w:instrText>PAGEREF _Toc243685770 \h</w:instrText>
       </w:r>
       <w:r>
         <w:rPr>
@@ -1937,7 +1937,7 @@
           <w:noProof/>
           <w:webHidden/>
         </w:rPr>
-        <w:instrText>PAGEREF _Toc243685232 \h</w:instrText>
+        <w:instrText>PAGEREF _Toc243685771 \h</w:instrText>
       </w:r>
       <w:r>
         <w:rPr>
@@ -2030,7 +2030,7 @@
           <w:noProof/>
           <w:webHidden/>
         </w:rPr>
-        <w:instrText>PAGEREF _Toc243685233 \h</w:instrText>
+        <w:instrText>PAGEREF _Toc243685772 \h</w:instrText>
       </w:r>
       <w:r>
         <w:rPr>
@@ -2123,7 +2123,7 @@
           <w:noProof/>
           <w:webHidden/>
         </w:rPr>
-        <w:instrText>PAGEREF _Toc243685234 \h</w:instrText>
+        <w:instrText>PAGEREF _Toc243685773 \h</w:instrText>
       </w:r>
       <w:r>
         <w:rPr>
@@ -2215,7 +2215,7 @@
           <w:noProof/>
           <w:webHidden/>
         </w:rPr>
-        <w:instrText>PAGEREF _Toc243685235 \h</w:instrText>
+        <w:instrText>PAGEREF _Toc243685774 \h</w:instrText>
       </w:r>
       <w:r>
         <w:rPr>
@@ -2308,7 +2308,7 @@
           <w:noProof/>
           <w:webHidden/>
         </w:rPr>
-        <w:instrText>PAGEREF _Toc243685236 \h</w:instrText>
+        <w:instrText>PAGEREF _Toc243685775 \h</w:instrText>
       </w:r>
       <w:r>
         <w:rPr>
@@ -2401,7 +2401,7 @@
           <w:noProof/>
           <w:webHidden/>
         </w:rPr>
-        <w:instrText>PAGEREF _Toc243685237 \h</w:instrText>
+        <w:instrText>PAGEREF _Toc243685776 \h</w:instrText>
       </w:r>
       <w:r>
         <w:rPr>
@@ -2494,7 +2494,7 @@
           <w:noProof/>
           <w:webHidden/>
         </w:rPr>
-        <w:instrText>PAGEREF _Toc243685238 \h</w:instrText>
+        <w:instrText>PAGEREF _Toc243685777 \h</w:instrText>
       </w:r>
       <w:r>
         <w:rPr>
@@ -2587,7 +2587,7 @@
           <w:noProof/>
           <w:webHidden/>
         </w:rPr>
-        <w:instrText>PAGEREF _Toc243685239 \h</w:instrText>
+        <w:instrText>PAGEREF _Toc243685778 \h</w:instrText>
       </w:r>
       <w:r>
         <w:rPr>
@@ -2679,7 +2679,7 @@
           <w:noProof/>
           <w:webHidden/>
         </w:rPr>
-        <w:instrText>PAGEREF _Toc243685240 \h</w:instrText>
+        <w:instrText>PAGEREF _Toc243685779 \h</w:instrText>
       </w:r>
       <w:r>
         <w:rPr>
@@ -2772,7 +2772,7 @@
           <w:noProof/>
           <w:webHidden/>
         </w:rPr>
-        <w:instrText>PAGEREF _Toc243685241 \h</w:instrText>
+        <w:instrText>PAGEREF _Toc243685780 \h</w:instrText>
       </w:r>
       <w:r>
         <w:rPr>
@@ -2865,7 +2865,7 @@
           <w:noProof/>
           <w:webHidden/>
         </w:rPr>
-        <w:instrText>PAGEREF _Toc243685242 \h</w:instrText>
+        <w:instrText>PAGEREF _Toc243685781 \h</w:instrText>
       </w:r>
       <w:r>
         <w:rPr>
@@ -2958,7 +2958,7 @@
           <w:noProof/>
           <w:webHidden/>
         </w:rPr>
-        <w:instrText>PAGEREF _Toc243685243 \h</w:instrText>
+        <w:instrText>PAGEREF _Toc243685782 \h</w:instrText>
       </w:r>
       <w:r>
         <w:rPr>
@@ -3051,7 +3051,7 @@
           <w:noProof/>
           <w:webHidden/>
         </w:rPr>
-        <w:instrText>PAGEREF _Toc243685244 \h</w:instrText>
+        <w:instrText>PAGEREF _Toc243685783 \h</w:instrText>
       </w:r>
       <w:r>
         <w:rPr>
@@ -3144,7 +3144,7 @@
           <w:noProof/>
           <w:webHidden/>
         </w:rPr>
-        <w:instrText>PAGEREF _Toc243685245 \h</w:instrText>
+        <w:instrText>PAGEREF _Toc243685784 \h</w:instrText>
       </w:r>
       <w:r>
         <w:rPr>
@@ -3236,7 +3236,7 @@
           <w:noProof/>
           <w:webHidden/>
         </w:rPr>
-        <w:instrText>PAGEREF _Toc243685246 \h</w:instrText>
+        <w:instrText>PAGEREF _Toc243685785 \h</w:instrText>
       </w:r>
       <w:r>
         <w:rPr>
@@ -3329,7 +3329,7 @@
           <w:noProof/>
           <w:webHidden/>
         </w:rPr>
-        <w:instrText>PAGEREF _Toc243685247 \h</w:instrText>
+        <w:instrText>PAGEREF _Toc243685786 \h</w:instrText>
       </w:r>
       <w:r>
         <w:rPr>
@@ -3422,7 +3422,7 @@
           <w:noProof/>
           <w:webHidden/>
         </w:rPr>
-        <w:instrText>PAGEREF _Toc243685248 \h</w:instrText>
+        <w:instrText>PAGEREF _Toc243685787 \h</w:instrText>
       </w:r>
       <w:r>
         <w:rPr>
@@ -3515,7 +3515,7 @@
           <w:noProof/>
           <w:webHidden/>
         </w:rPr>
-        <w:instrText>PAGEREF _Toc243685249 \h</w:instrText>
+        <w:instrText>PAGEREF _Toc243685788 \h</w:instrText>
       </w:r>
       <w:r>
         <w:rPr>
@@ -3608,7 +3608,7 @@
           <w:noProof/>
           <w:webHidden/>
         </w:rPr>
-        <w:instrText>PAGEREF _Toc243685250 \h</w:instrText>
+        <w:instrText>PAGEREF _Toc243685789 \h</w:instrText>
       </w:r>
       <w:r>
         <w:rPr>
@@ -3701,7 +3701,7 @@
           <w:noProof/>
           <w:webHidden/>
         </w:rPr>
-        <w:instrText>PAGEREF _Toc243685251 \h</w:instrText>
+        <w:instrText>PAGEREF _Toc243685790 \h</w:instrText>
       </w:r>
       <w:r>
         <w:rPr>
@@ -3794,7 +3794,7 @@
           <w:noProof/>
           <w:webHidden/>
         </w:rPr>
-        <w:instrText>PAGEREF _Toc243685252 \h</w:instrText>
+        <w:instrText>PAGEREF _Toc243685791 \h</w:instrText>
       </w:r>
       <w:r>
         <w:rPr>
@@ -3887,7 +3887,7 @@
           <w:noProof/>
           <w:webHidden/>
         </w:rPr>
-        <w:instrText>PAGEREF _Toc243685253 \h</w:instrText>
+        <w:instrText>PAGEREF _Toc243685792 \h</w:instrText>
       </w:r>
       <w:r>
         <w:rPr>
@@ -3980,7 +3980,7 @@
           <w:noProof/>
           <w:webHidden/>
         </w:rPr>
-        <w:instrText>PAGEREF _Toc243685254 \h</w:instrText>
+        <w:instrText>PAGEREF _Toc243685793 \h</w:instrText>
       </w:r>
       <w:r>
         <w:rPr>
@@ -4073,7 +4073,7 @@
           <w:noProof/>
           <w:webHidden/>
         </w:rPr>
-        <w:instrText>PAGEREF _Toc243685255 \h</w:instrText>
+        <w:instrText>PAGEREF _Toc243685794 \h</w:instrText>
       </w:r>
       <w:r>
         <w:rPr>
@@ -4166,7 +4166,7 @@
           <w:noProof/>
           <w:webHidden/>
         </w:rPr>
-        <w:instrText>PAGEREF _Toc243685256 \h</w:instrText>
+        <w:instrText>PAGEREF _Toc243685795 \h</w:instrText>
       </w:r>
       <w:r>
         <w:rPr>
@@ -4260,7 +4260,7 @@
           <w:noProof/>
           <w:webHidden/>
         </w:rPr>
-        <w:instrText>PAGEREF _Toc243685257 \h</w:instrText>
+        <w:instrText>PAGEREF _Toc243685796 \h</w:instrText>
       </w:r>
       <w:r>
         <w:rPr>
@@ -4352,7 +4352,7 @@
           <w:noProof/>
           <w:webHidden/>
         </w:rPr>
-        <w:instrText>PAGEREF _Toc243685258 \h</w:instrText>
+        <w:instrText>PAGEREF _Toc243685797 \h</w:instrText>
       </w:r>
       <w:r>
         <w:rPr>
@@ -4445,7 +4445,7 @@
           <w:noProof/>
           <w:webHidden/>
         </w:rPr>
-        <w:instrText>PAGEREF _Toc243685259 \h</w:instrText>
+        <w:instrText>PAGEREF _Toc243685798 \h</w:instrText>
       </w:r>
       <w:r>
         <w:rPr>
@@ -4538,7 +4538,7 @@
           <w:noProof/>
           <w:webHidden/>
         </w:rPr>
-        <w:instrText>PAGEREF _Toc243685260 \h</w:instrText>
+        <w:instrText>PAGEREF _Toc243685799 \h</w:instrText>
       </w:r>
       <w:r>
         <w:rPr>
@@ -4631,7 +4631,7 @@
           <w:noProof/>
           <w:webHidden/>
         </w:rPr>
-        <w:instrText>PAGEREF _Toc243685261 \h</w:instrText>
+        <w:instrText>PAGEREF _Toc243685800 \h</w:instrText>
       </w:r>
       <w:r>
         <w:rPr>
@@ -4724,7 +4724,7 @@
           <w:noProof/>
           <w:webHidden/>
         </w:rPr>
-        <w:instrText>PAGEREF _Toc243685262 \h</w:instrText>
+        <w:instrText>PAGEREF _Toc243685801 \h</w:instrText>
       </w:r>
       <w:r>
         <w:rPr>
@@ -4816,7 +4816,7 @@
           <w:noProof/>
           <w:webHidden/>
         </w:rPr>
-        <w:instrText>PAGEREF _Toc243685263 \h</w:instrText>
+        <w:instrText>PAGEREF _Toc243685802 \h</w:instrText>
       </w:r>
       <w:r>
         <w:rPr>
@@ -4908,7 +4908,7 @@
           <w:noProof/>
           <w:webHidden/>
         </w:rPr>
-        <w:instrText>PAGEREF _Toc243685264 \h</w:instrText>
+        <w:instrText>PAGEREF _Toc243685803 \h</w:instrText>
       </w:r>
       <w:r>
         <w:rPr>
@@ -5000,7 +5000,7 @@
           <w:noProof/>
           <w:webHidden/>
         </w:rPr>
-        <w:instrText>PAGEREF _Toc243685265 \h</w:instrText>
+        <w:instrText>PAGEREF _Toc243685804 \h</w:instrText>
       </w:r>
       <w:r>
         <w:rPr>
@@ -5092,7 +5092,7 @@
           <w:noProof/>
           <w:webHidden/>
         </w:rPr>
-        <w:instrText>PAGEREF _Toc243685266 \h</w:instrText>
+        <w:instrText>PAGEREF _Toc243685805 \h</w:instrText>
       </w:r>
       <w:r>
         <w:rPr>
@@ -5184,7 +5184,7 @@
           <w:noProof/>
           <w:webHidden/>
         </w:rPr>
-        <w:instrText>PAGEREF _Toc243685267 \h</w:instrText>
+        <w:instrText>PAGEREF _Toc243685806 \h</w:instrText>
       </w:r>
       <w:r>
         <w:rPr>
@@ -5248,7 +5248,7 @@
           <w:rFonts w:hint="eastAsia"/>
         </w:rPr>
       </w:pPr>
-      <w:bookmarkStart w:id="0" w:name="_Toc243685216"/>
+      <w:bookmarkStart w:id="0" w:name="_Toc243685755"/>
       <w:r>
         <w:lastRenderedPageBreak/>
         <w:t>一．系统开发背景</w:t>
@@ -5262,7 +5262,7 @@
           <w:rFonts w:hint="eastAsia"/>
         </w:rPr>
       </w:pPr>
-      <w:bookmarkStart w:id="1" w:name="_Toc243685217"/>
+      <w:bookmarkStart w:id="1" w:name="_Toc243685756"/>
       <w:r>
         <w:t xml:space="preserve">1.1 </w:t>
       </w:r>
@@ -5342,7 +5342,7 @@
           <w:rFonts w:hint="eastAsia"/>
         </w:rPr>
       </w:pPr>
-      <w:bookmarkStart w:id="2" w:name="_Toc243685218"/>
+      <w:bookmarkStart w:id="2" w:name="_Toc243685757"/>
       <w:r>
         <w:t xml:space="preserve">1.2 </w:t>
       </w:r>
@@ -5537,7 +5537,7 @@
           <w:rFonts w:hint="eastAsia"/>
         </w:rPr>
       </w:pPr>
-      <w:bookmarkStart w:id="3" w:name="_Toc243685219"/>
+      <w:bookmarkStart w:id="3" w:name="_Toc243685758"/>
       <w:r>
         <w:lastRenderedPageBreak/>
         <w:t xml:space="preserve">1.3 </w:t>
@@ -5751,7 +5751,7 @@
           <w:rFonts w:hint="eastAsia"/>
         </w:rPr>
       </w:pPr>
-      <w:bookmarkStart w:id="4" w:name="_Toc243685220"/>
+      <w:bookmarkStart w:id="4" w:name="_Toc243685759"/>
       <w:r>
         <w:lastRenderedPageBreak/>
         <w:t>二．实验环境及配置介绍</w:t>
@@ -5775,10 +5775,16 @@
         <w:t>为开发主机，使用</w:t>
       </w:r>
       <w:r>
-        <w:t xml:space="preserve"> JDK 17 </w:t>
-      </w:r>
-      <w:r>
-        <w:t>编译，</w:t>
+        <w:t xml:space="preserve"> IntelliJ IDEA / VS Code </w:t>
+      </w:r>
+      <w:r>
+        <w:t>进行开发，</w:t>
+      </w:r>
+      <w:r>
+        <w:t xml:space="preserve">JDK 17 </w:t>
+      </w:r>
+      <w:r>
+        <w:t>编译运行，</w:t>
       </w:r>
       <w:r>
         <w:t xml:space="preserve">MySQL 8.0 </w:t>
@@ -5800,7 +5806,7 @@
           <w:rFonts w:hint="eastAsia"/>
         </w:rPr>
       </w:pPr>
-      <w:bookmarkStart w:id="5" w:name="_Toc243685221"/>
+      <w:bookmarkStart w:id="5" w:name="_Toc243685760"/>
       <w:r>
         <w:t xml:space="preserve">2.1 </w:t>
       </w:r>
@@ -5834,10 +5840,10 @@
         <w:tblLook w:val="04A0" w:firstRow="1" w:lastRow="0" w:firstColumn="1" w:lastColumn="0" w:noHBand="0" w:noVBand="1"/>
       </w:tblPr>
       <w:tblGrid>
-        <w:gridCol w:w="1655"/>
-        <w:gridCol w:w="2550"/>
-        <w:gridCol w:w="1775"/>
-        <w:gridCol w:w="2316"/>
+        <w:gridCol w:w="1668"/>
+        <w:gridCol w:w="2545"/>
+        <w:gridCol w:w="1772"/>
+        <w:gridCol w:w="2311"/>
       </w:tblGrid>
       <w:tr>
         <w:trPr>
@@ -6120,7 +6126,7 @@
                 <w:rFonts w:ascii="宋体" w:eastAsia="宋体" w:hAnsi="宋体"/>
                 <w:sz w:val="20"/>
               </w:rPr>
-              <w:t>编译与运行</w:t>
+              <w:t>提供</w:t>
             </w:r>
             <w:r>
               <w:rPr>
@@ -6134,7 +6140,7 @@
                 <w:rFonts w:ascii="宋体" w:eastAsia="宋体" w:hAnsi="宋体"/>
                 <w:sz w:val="20"/>
               </w:rPr>
-              <w:t>程序</w:t>
+              <w:t>编译与运行环境</w:t>
             </w:r>
           </w:p>
         </w:tc>
@@ -6159,7 +6165,21 @@
                 <w:rFonts w:ascii="宋体" w:eastAsia="宋体" w:hAnsi="宋体"/>
                 <w:sz w:val="20"/>
               </w:rPr>
-              <w:t>构建工具</w:t>
+              <w:t>集成开发环境（</w:t>
+            </w:r>
+            <w:r>
+              <w:rPr>
+                <w:rFonts w:ascii="宋体" w:eastAsia="宋体" w:hAnsi="宋体"/>
+                <w:sz w:val="20"/>
+              </w:rPr>
+              <w:t>IDE</w:t>
+            </w:r>
+            <w:r>
+              <w:rPr>
+                <w:rFonts w:ascii="宋体" w:eastAsia="宋体" w:hAnsi="宋体"/>
+                <w:sz w:val="20"/>
+              </w:rPr>
+              <w:t>）</w:t>
             </w:r>
           </w:p>
         </w:tc>
@@ -6179,7 +6199,7 @@
                 <w:rFonts w:ascii="宋体" w:eastAsia="宋体" w:hAnsi="宋体"/>
                 <w:sz w:val="20"/>
               </w:rPr>
-              <w:t>Apache Maven</w:t>
+              <w:t>IntelliJ IDEA / VS Code</w:t>
             </w:r>
           </w:p>
         </w:tc>
@@ -6199,7 +6219,14 @@
                 <w:rFonts w:ascii="宋体" w:eastAsia="宋体" w:hAnsi="宋体"/>
                 <w:sz w:val="20"/>
               </w:rPr>
-              <w:t>3.9.x</w:t>
+              <w:t xml:space="preserve">2024.x / </w:t>
+            </w:r>
+            <w:r>
+              <w:rPr>
+                <w:rFonts w:ascii="宋体" w:eastAsia="宋体" w:hAnsi="宋体"/>
+                <w:sz w:val="20"/>
+              </w:rPr>
+              <w:t>最新版</w:t>
             </w:r>
           </w:p>
         </w:tc>
@@ -6219,7 +6246,21 @@
                 <w:rFonts w:ascii="宋体" w:eastAsia="宋体" w:hAnsi="宋体"/>
                 <w:sz w:val="20"/>
               </w:rPr>
-              <w:t>依赖管理与打包</w:t>
+              <w:t>编写、编译、调试和运行</w:t>
+            </w:r>
+            <w:r>
+              <w:rPr>
+                <w:rFonts w:ascii="宋体" w:eastAsia="宋体" w:hAnsi="宋体"/>
+                <w:sz w:val="20"/>
+              </w:rPr>
+              <w:t xml:space="preserve"> Java </w:t>
+            </w:r>
+            <w:r>
+              <w:rPr>
+                <w:rFonts w:ascii="宋体" w:eastAsia="宋体" w:hAnsi="宋体"/>
+                <w:sz w:val="20"/>
+              </w:rPr>
+              <w:t>程序</w:t>
             </w:r>
           </w:p>
         </w:tc>
@@ -6244,7 +6285,7 @@
                 <w:rFonts w:ascii="宋体" w:eastAsia="宋体" w:hAnsi="宋体"/>
                 <w:sz w:val="20"/>
               </w:rPr>
-              <w:t>框架</w:t>
+              <w:t>构建工具</w:t>
             </w:r>
           </w:p>
         </w:tc>
@@ -6264,7 +6305,7 @@
                 <w:rFonts w:ascii="宋体" w:eastAsia="宋体" w:hAnsi="宋体"/>
                 <w:sz w:val="20"/>
               </w:rPr>
-              <w:t>Spring Boot</w:t>
+              <w:t>Apache Maven</w:t>
             </w:r>
           </w:p>
         </w:tc>
@@ -6284,7 +6325,7 @@
                 <w:rFonts w:ascii="宋体" w:eastAsia="宋体" w:hAnsi="宋体"/>
                 <w:sz w:val="20"/>
               </w:rPr>
-              <w:t>3.5.0</w:t>
+              <w:t>3.9.x</w:t>
             </w:r>
           </w:p>
         </w:tc>
@@ -6304,28 +6345,7 @@
                 <w:rFonts w:ascii="宋体" w:eastAsia="宋体" w:hAnsi="宋体"/>
                 <w:sz w:val="20"/>
               </w:rPr>
-              <w:t>Web</w:t>
-            </w:r>
-            <w:r>
-              <w:rPr>
-                <w:rFonts w:ascii="宋体" w:eastAsia="宋体" w:hAnsi="宋体"/>
-                <w:sz w:val="20"/>
-              </w:rPr>
-              <w:t>、</w:t>
-            </w:r>
-            <w:r>
-              <w:rPr>
-                <w:rFonts w:ascii="宋体" w:eastAsia="宋体" w:hAnsi="宋体"/>
-                <w:sz w:val="20"/>
-              </w:rPr>
-              <w:t>IoC</w:t>
-            </w:r>
-            <w:r>
-              <w:rPr>
-                <w:rFonts w:ascii="宋体" w:eastAsia="宋体" w:hAnsi="宋体"/>
-                <w:sz w:val="20"/>
-              </w:rPr>
-              <w:t>、事务、嵌入式容器</w:t>
+              <w:t>依赖管理与打包</w:t>
             </w:r>
           </w:p>
         </w:tc>
@@ -6350,7 +6370,7 @@
                 <w:rFonts w:ascii="宋体" w:eastAsia="宋体" w:hAnsi="宋体"/>
                 <w:sz w:val="20"/>
               </w:rPr>
-              <w:t>持久层</w:t>
+              <w:t>框架</w:t>
             </w:r>
           </w:p>
         </w:tc>
@@ -6370,7 +6390,7 @@
                 <w:rFonts w:ascii="宋体" w:eastAsia="宋体" w:hAnsi="宋体"/>
                 <w:sz w:val="20"/>
               </w:rPr>
-              <w:t>MyBatis Spring Boot Starter</w:t>
+              <w:t>Spring Boot</w:t>
             </w:r>
           </w:p>
         </w:tc>
@@ -6390,7 +6410,7 @@
                 <w:rFonts w:ascii="宋体" w:eastAsia="宋体" w:hAnsi="宋体"/>
                 <w:sz w:val="20"/>
               </w:rPr>
-              <w:t>3.0.5</w:t>
+              <w:t>3.5.0</w:t>
             </w:r>
           </w:p>
         </w:tc>
@@ -6410,14 +6430,28 @@
                 <w:rFonts w:ascii="宋体" w:eastAsia="宋体" w:hAnsi="宋体"/>
                 <w:sz w:val="20"/>
               </w:rPr>
-              <w:t xml:space="preserve">SQL </w:t>
+              <w:t>Web</w:t>
             </w:r>
             <w:r>
               <w:rPr>
                 <w:rFonts w:ascii="宋体" w:eastAsia="宋体" w:hAnsi="宋体"/>
                 <w:sz w:val="20"/>
               </w:rPr>
-              <w:t>映射与数据访问</w:t>
+              <w:t>、</w:t>
+            </w:r>
+            <w:r>
+              <w:rPr>
+                <w:rFonts w:ascii="宋体" w:eastAsia="宋体" w:hAnsi="宋体"/>
+                <w:sz w:val="20"/>
+              </w:rPr>
+              <w:t>IoC</w:t>
+            </w:r>
+            <w:r>
+              <w:rPr>
+                <w:rFonts w:ascii="宋体" w:eastAsia="宋体" w:hAnsi="宋体"/>
+                <w:sz w:val="20"/>
+              </w:rPr>
+              <w:t>、事务、嵌入式容器</w:t>
             </w:r>
           </w:p>
         </w:tc>
@@ -6442,7 +6476,7 @@
                 <w:rFonts w:ascii="宋体" w:eastAsia="宋体" w:hAnsi="宋体"/>
                 <w:sz w:val="20"/>
               </w:rPr>
-              <w:t>模板引擎</w:t>
+              <w:t>持久层</w:t>
             </w:r>
           </w:p>
         </w:tc>
@@ -6462,7 +6496,7 @@
                 <w:rFonts w:ascii="宋体" w:eastAsia="宋体" w:hAnsi="宋体"/>
                 <w:sz w:val="20"/>
               </w:rPr>
-              <w:t>Thymeleaf</w:t>
+              <w:t>MyBatis Spring Boot Starter</w:t>
             </w:r>
           </w:p>
         </w:tc>
@@ -6482,7 +6516,7 @@
                 <w:rFonts w:ascii="宋体" w:eastAsia="宋体" w:hAnsi="宋体"/>
                 <w:sz w:val="20"/>
               </w:rPr>
-              <w:t>3.1.x</w:t>
+              <w:t>3.0.5</w:t>
             </w:r>
           </w:p>
         </w:tc>
@@ -6502,7 +6536,14 @@
                 <w:rFonts w:ascii="宋体" w:eastAsia="宋体" w:hAnsi="宋体"/>
                 <w:sz w:val="20"/>
               </w:rPr>
-              <w:t>服务端渲染页面</w:t>
+              <w:t xml:space="preserve">SQL </w:t>
+            </w:r>
+            <w:r>
+              <w:rPr>
+                <w:rFonts w:ascii="宋体" w:eastAsia="宋体" w:hAnsi="宋体"/>
+                <w:sz w:val="20"/>
+              </w:rPr>
+              <w:t>映射与数据访问</w:t>
             </w:r>
           </w:p>
         </w:tc>
@@ -6527,7 +6568,7 @@
                 <w:rFonts w:ascii="宋体" w:eastAsia="宋体" w:hAnsi="宋体"/>
                 <w:sz w:val="20"/>
               </w:rPr>
-              <w:t>数据库</w:t>
+              <w:t>模板引擎</w:t>
             </w:r>
           </w:p>
         </w:tc>
@@ -6547,7 +6588,7 @@
                 <w:rFonts w:ascii="宋体" w:eastAsia="宋体" w:hAnsi="宋体"/>
                 <w:sz w:val="20"/>
               </w:rPr>
-              <w:t>MySQL Community Server</w:t>
+              <w:t>Thymeleaf</w:t>
             </w:r>
           </w:p>
         </w:tc>
@@ -6567,7 +6608,7 @@
                 <w:rFonts w:ascii="宋体" w:eastAsia="宋体" w:hAnsi="宋体"/>
                 <w:sz w:val="20"/>
               </w:rPr>
-              <w:t>8.0</w:t>
+              <w:t>3.1.x</w:t>
             </w:r>
           </w:p>
         </w:tc>
@@ -6587,7 +6628,7 @@
                 <w:rFonts w:ascii="宋体" w:eastAsia="宋体" w:hAnsi="宋体"/>
                 <w:sz w:val="20"/>
               </w:rPr>
-              <w:t>业务数据存储</w:t>
+              <w:t>服务端渲染页面</w:t>
             </w:r>
           </w:p>
         </w:tc>
@@ -6612,7 +6653,7 @@
                 <w:rFonts w:ascii="宋体" w:eastAsia="宋体" w:hAnsi="宋体"/>
                 <w:sz w:val="20"/>
               </w:rPr>
-              <w:t>数据库客户端</w:t>
+              <w:t>数据库</w:t>
             </w:r>
           </w:p>
         </w:tc>
@@ -6632,61 +6673,47 @@
                 <w:rFonts w:ascii="宋体" w:eastAsia="宋体" w:hAnsi="宋体"/>
                 <w:sz w:val="20"/>
               </w:rPr>
-              <w:t xml:space="preserve">MySQL </w:t>
-            </w:r>
+              <w:t>MySQL Community Server</w:t>
+            </w:r>
+          </w:p>
+        </w:tc>
+        <w:tc>
+          <w:tcPr>
+            <w:tcW w:w="1814" w:type="dxa"/>
+          </w:tcPr>
+          <w:p>
+            <w:pPr>
+              <w:jc w:val="left"/>
+              <w:rPr>
+                <w:rFonts w:hint="eastAsia"/>
+              </w:rPr>
+            </w:pPr>
             <w:r>
               <w:rPr>
                 <w:rFonts w:ascii="宋体" w:eastAsia="宋体" w:hAnsi="宋体"/>
                 <w:sz w:val="20"/>
               </w:rPr>
-              <w:t>命令行</w:t>
-            </w:r>
+              <w:t>8.0</w:t>
+            </w:r>
+          </w:p>
+        </w:tc>
+        <w:tc>
+          <w:tcPr>
+            <w:tcW w:w="2381" w:type="dxa"/>
+          </w:tcPr>
+          <w:p>
+            <w:pPr>
+              <w:jc w:val="left"/>
+              <w:rPr>
+                <w:rFonts w:hint="eastAsia"/>
+              </w:rPr>
+            </w:pPr>
             <w:r>
               <w:rPr>
                 <w:rFonts w:ascii="宋体" w:eastAsia="宋体" w:hAnsi="宋体"/>
                 <w:sz w:val="20"/>
               </w:rPr>
-              <w:t xml:space="preserve"> / Navicat</w:t>
-            </w:r>
-          </w:p>
-        </w:tc>
-        <w:tc>
-          <w:tcPr>
-            <w:tcW w:w="1814" w:type="dxa"/>
-          </w:tcPr>
-          <w:p>
-            <w:pPr>
-              <w:jc w:val="left"/>
-              <w:rPr>
-                <w:rFonts w:hint="eastAsia"/>
-              </w:rPr>
-            </w:pPr>
-            <w:r>
-              <w:rPr>
-                <w:rFonts w:ascii="宋体" w:eastAsia="宋体" w:hAnsi="宋体"/>
-                <w:sz w:val="20"/>
-              </w:rPr>
-              <w:t>8.x</w:t>
-            </w:r>
-          </w:p>
-        </w:tc>
-        <w:tc>
-          <w:tcPr>
-            <w:tcW w:w="2381" w:type="dxa"/>
-          </w:tcPr>
-          <w:p>
-            <w:pPr>
-              <w:jc w:val="left"/>
-              <w:rPr>
-                <w:rFonts w:hint="eastAsia"/>
-              </w:rPr>
-            </w:pPr>
-            <w:r>
-              <w:rPr>
-                <w:rFonts w:ascii="宋体" w:eastAsia="宋体" w:hAnsi="宋体"/>
-                <w:sz w:val="20"/>
-              </w:rPr>
-              <w:t>建库、执行脚本、查询</w:t>
+              <w:t>业务数据存储</w:t>
             </w:r>
           </w:p>
         </w:tc>
@@ -6711,7 +6738,7 @@
                 <w:rFonts w:ascii="宋体" w:eastAsia="宋体" w:hAnsi="宋体"/>
                 <w:sz w:val="20"/>
               </w:rPr>
-              <w:t>容器</w:t>
+              <w:t>数据库客户端</w:t>
             </w:r>
           </w:p>
         </w:tc>
@@ -6731,7 +6758,21 @@
                 <w:rFonts w:ascii="宋体" w:eastAsia="宋体" w:hAnsi="宋体"/>
                 <w:sz w:val="20"/>
               </w:rPr>
-              <w:t>Docker Engine + Compose</w:t>
+              <w:t xml:space="preserve">MySQL </w:t>
+            </w:r>
+            <w:r>
+              <w:rPr>
+                <w:rFonts w:ascii="宋体" w:eastAsia="宋体" w:hAnsi="宋体"/>
+                <w:sz w:val="20"/>
+              </w:rPr>
+              <w:t>命令行</w:t>
+            </w:r>
+            <w:r>
+              <w:rPr>
+                <w:rFonts w:ascii="宋体" w:eastAsia="宋体" w:hAnsi="宋体"/>
+                <w:sz w:val="20"/>
+              </w:rPr>
+              <w:t xml:space="preserve"> / Navicat</w:t>
             </w:r>
           </w:p>
         </w:tc>
@@ -6751,7 +6792,7 @@
                 <w:rFonts w:ascii="宋体" w:eastAsia="宋体" w:hAnsi="宋体"/>
                 <w:sz w:val="20"/>
               </w:rPr>
-              <w:t>29.6 / v5.3</w:t>
+              <w:t>8.x</w:t>
             </w:r>
           </w:p>
         </w:tc>
@@ -6771,7 +6812,7 @@
                 <w:rFonts w:ascii="宋体" w:eastAsia="宋体" w:hAnsi="宋体"/>
                 <w:sz w:val="20"/>
               </w:rPr>
-              <w:t>镜像构建与多容器编排</w:t>
+              <w:t>建库、执行脚本、查询</w:t>
             </w:r>
           </w:p>
         </w:tc>
@@ -6796,20 +6837,33 @@
                 <w:rFonts w:ascii="宋体" w:eastAsia="宋体" w:hAnsi="宋体"/>
                 <w:sz w:val="20"/>
               </w:rPr>
-              <w:t xml:space="preserve">Web </w:t>
-            </w:r>
+              <w:t>容器</w:t>
+            </w:r>
+          </w:p>
+        </w:tc>
+        <w:tc>
+          <w:tcPr>
+            <w:tcW w:w="2608" w:type="dxa"/>
+          </w:tcPr>
+          <w:p>
+            <w:pPr>
+              <w:jc w:val="left"/>
+              <w:rPr>
+                <w:rFonts w:hint="eastAsia"/>
+              </w:rPr>
+            </w:pPr>
             <w:r>
               <w:rPr>
                 <w:rFonts w:ascii="宋体" w:eastAsia="宋体" w:hAnsi="宋体"/>
                 <w:sz w:val="20"/>
               </w:rPr>
-              <w:t>服务器</w:t>
-            </w:r>
-          </w:p>
-        </w:tc>
-        <w:tc>
-          <w:tcPr>
-            <w:tcW w:w="2608" w:type="dxa"/>
+              <w:t>Docker Engine + Compose</w:t>
+            </w:r>
+          </w:p>
+        </w:tc>
+        <w:tc>
+          <w:tcPr>
+            <w:tcW w:w="1814" w:type="dxa"/>
           </w:tcPr>
           <w:p>
             <w:pPr>
@@ -6823,13 +6877,13 @@
                 <w:rFonts w:ascii="宋体" w:eastAsia="宋体" w:hAnsi="宋体"/>
                 <w:sz w:val="20"/>
               </w:rPr>
-              <w:t>Nginx</w:t>
-            </w:r>
-          </w:p>
-        </w:tc>
-        <w:tc>
-          <w:tcPr>
-            <w:tcW w:w="1814" w:type="dxa"/>
+              <w:t>29.6 / v5.3</w:t>
+            </w:r>
+          </w:p>
+        </w:tc>
+        <w:tc>
+          <w:tcPr>
+            <w:tcW w:w="2381" w:type="dxa"/>
           </w:tcPr>
           <w:p>
             <w:pPr>
@@ -6843,27 +6897,7 @@
                 <w:rFonts w:ascii="宋体" w:eastAsia="宋体" w:hAnsi="宋体"/>
                 <w:sz w:val="20"/>
               </w:rPr>
-              <w:t>1.27</w:t>
-            </w:r>
-          </w:p>
-        </w:tc>
-        <w:tc>
-          <w:tcPr>
-            <w:tcW w:w="2381" w:type="dxa"/>
-          </w:tcPr>
-          <w:p>
-            <w:pPr>
-              <w:jc w:val="left"/>
-              <w:rPr>
-                <w:rFonts w:hint="eastAsia"/>
-              </w:rPr>
-            </w:pPr>
-            <w:r>
-              <w:rPr>
-                <w:rFonts w:ascii="宋体" w:eastAsia="宋体" w:hAnsi="宋体"/>
-                <w:sz w:val="20"/>
-              </w:rPr>
-              <w:t>静态资源托管与反向代理</w:t>
+              <w:t>镜像构建与多容器编排</w:t>
             </w:r>
           </w:p>
         </w:tc>
@@ -6888,7 +6922,14 @@
                 <w:rFonts w:ascii="宋体" w:eastAsia="宋体" w:hAnsi="宋体"/>
                 <w:sz w:val="20"/>
               </w:rPr>
-              <w:t>应用服务器</w:t>
+              <w:t xml:space="preserve">Web </w:t>
+            </w:r>
+            <w:r>
+              <w:rPr>
+                <w:rFonts w:ascii="宋体" w:eastAsia="宋体" w:hAnsi="宋体"/>
+                <w:sz w:val="20"/>
+              </w:rPr>
+              <w:t>服务器</w:t>
             </w:r>
           </w:p>
         </w:tc>
@@ -6908,7 +6949,7 @@
                 <w:rFonts w:ascii="宋体" w:eastAsia="宋体" w:hAnsi="宋体"/>
                 <w:sz w:val="20"/>
               </w:rPr>
-              <w:t>Apache Tomcat</w:t>
+              <w:t>Nginx</w:t>
             </w:r>
           </w:p>
         </w:tc>
@@ -6928,62 +6969,27 @@
                 <w:rFonts w:ascii="宋体" w:eastAsia="宋体" w:hAnsi="宋体"/>
                 <w:sz w:val="20"/>
               </w:rPr>
-              <w:t>10.1</w:t>
-            </w:r>
+              <w:t>1.27</w:t>
+            </w:r>
+          </w:p>
+        </w:tc>
+        <w:tc>
+          <w:tcPr>
+            <w:tcW w:w="2381" w:type="dxa"/>
+          </w:tcPr>
+          <w:p>
+            <w:pPr>
+              <w:jc w:val="left"/>
+              <w:rPr>
+                <w:rFonts w:hint="eastAsia"/>
+              </w:rPr>
+            </w:pPr>
             <w:r>
               <w:rPr>
                 <w:rFonts w:ascii="宋体" w:eastAsia="宋体" w:hAnsi="宋体"/>
                 <w:sz w:val="20"/>
               </w:rPr>
-              <w:t>（</w:t>
-            </w:r>
-            <w:r>
-              <w:rPr>
-                <w:rFonts w:ascii="宋体" w:eastAsia="宋体" w:hAnsi="宋体"/>
-                <w:sz w:val="20"/>
-              </w:rPr>
-              <w:t>JDK 17</w:t>
-            </w:r>
-            <w:r>
-              <w:rPr>
-                <w:rFonts w:ascii="宋体" w:eastAsia="宋体" w:hAnsi="宋体"/>
-                <w:sz w:val="20"/>
-              </w:rPr>
-              <w:t>）</w:t>
-            </w:r>
-          </w:p>
-        </w:tc>
-        <w:tc>
-          <w:tcPr>
-            <w:tcW w:w="2381" w:type="dxa"/>
-          </w:tcPr>
-          <w:p>
-            <w:pPr>
-              <w:jc w:val="left"/>
-              <w:rPr>
-                <w:rFonts w:hint="eastAsia"/>
-              </w:rPr>
-            </w:pPr>
-            <w:r>
-              <w:rPr>
-                <w:rFonts w:ascii="宋体" w:eastAsia="宋体" w:hAnsi="宋体"/>
-                <w:sz w:val="20"/>
-              </w:rPr>
-              <w:t>部署</w:t>
-            </w:r>
-            <w:r>
-              <w:rPr>
-                <w:rFonts w:ascii="宋体" w:eastAsia="宋体" w:hAnsi="宋体"/>
-                <w:sz w:val="20"/>
-              </w:rPr>
-              <w:t xml:space="preserve"> WAR </w:t>
-            </w:r>
-            <w:r>
-              <w:rPr>
-                <w:rFonts w:ascii="宋体" w:eastAsia="宋体" w:hAnsi="宋体"/>
-                <w:sz w:val="20"/>
-              </w:rPr>
-              <w:t>包</w:t>
+              <w:t>静态资源托管与反向代理</w:t>
             </w:r>
           </w:p>
         </w:tc>
@@ -7008,6 +7014,126 @@
                 <w:rFonts w:ascii="宋体" w:eastAsia="宋体" w:hAnsi="宋体"/>
                 <w:sz w:val="20"/>
               </w:rPr>
+              <w:t>应用服务器</w:t>
+            </w:r>
+          </w:p>
+        </w:tc>
+        <w:tc>
+          <w:tcPr>
+            <w:tcW w:w="2608" w:type="dxa"/>
+          </w:tcPr>
+          <w:p>
+            <w:pPr>
+              <w:jc w:val="left"/>
+              <w:rPr>
+                <w:rFonts w:hint="eastAsia"/>
+              </w:rPr>
+            </w:pPr>
+            <w:r>
+              <w:rPr>
+                <w:rFonts w:ascii="宋体" w:eastAsia="宋体" w:hAnsi="宋体"/>
+                <w:sz w:val="20"/>
+              </w:rPr>
+              <w:t>Apache Tomcat</w:t>
+            </w:r>
+          </w:p>
+        </w:tc>
+        <w:tc>
+          <w:tcPr>
+            <w:tcW w:w="1814" w:type="dxa"/>
+          </w:tcPr>
+          <w:p>
+            <w:pPr>
+              <w:jc w:val="left"/>
+              <w:rPr>
+                <w:rFonts w:hint="eastAsia"/>
+              </w:rPr>
+            </w:pPr>
+            <w:r>
+              <w:rPr>
+                <w:rFonts w:ascii="宋体" w:eastAsia="宋体" w:hAnsi="宋体"/>
+                <w:sz w:val="20"/>
+              </w:rPr>
+              <w:t>10.1</w:t>
+            </w:r>
+            <w:r>
+              <w:rPr>
+                <w:rFonts w:ascii="宋体" w:eastAsia="宋体" w:hAnsi="宋体"/>
+                <w:sz w:val="20"/>
+              </w:rPr>
+              <w:t>（</w:t>
+            </w:r>
+            <w:r>
+              <w:rPr>
+                <w:rFonts w:ascii="宋体" w:eastAsia="宋体" w:hAnsi="宋体"/>
+                <w:sz w:val="20"/>
+              </w:rPr>
+              <w:t>JDK 17</w:t>
+            </w:r>
+            <w:r>
+              <w:rPr>
+                <w:rFonts w:ascii="宋体" w:eastAsia="宋体" w:hAnsi="宋体"/>
+                <w:sz w:val="20"/>
+              </w:rPr>
+              <w:t>）</w:t>
+            </w:r>
+          </w:p>
+        </w:tc>
+        <w:tc>
+          <w:tcPr>
+            <w:tcW w:w="2381" w:type="dxa"/>
+          </w:tcPr>
+          <w:p>
+            <w:pPr>
+              <w:jc w:val="left"/>
+              <w:rPr>
+                <w:rFonts w:hint="eastAsia"/>
+              </w:rPr>
+            </w:pPr>
+            <w:r>
+              <w:rPr>
+                <w:rFonts w:ascii="宋体" w:eastAsia="宋体" w:hAnsi="宋体"/>
+                <w:sz w:val="20"/>
+              </w:rPr>
+              <w:t>部署</w:t>
+            </w:r>
+            <w:r>
+              <w:rPr>
+                <w:rFonts w:ascii="宋体" w:eastAsia="宋体" w:hAnsi="宋体"/>
+                <w:sz w:val="20"/>
+              </w:rPr>
+              <w:t xml:space="preserve"> WAR </w:t>
+            </w:r>
+            <w:r>
+              <w:rPr>
+                <w:rFonts w:ascii="宋体" w:eastAsia="宋体" w:hAnsi="宋体"/>
+                <w:sz w:val="20"/>
+              </w:rPr>
+              <w:t>包</w:t>
+            </w:r>
+          </w:p>
+        </w:tc>
+      </w:tr>
+      <w:tr>
+        <w:trPr>
+          <w:jc w:val="center"/>
+        </w:trPr>
+        <w:tc>
+          <w:tcPr>
+            <w:tcW w:w="1701" w:type="dxa"/>
+          </w:tcPr>
+          <w:p>
+            <w:pPr>
+              <w:jc w:val="left"/>
+              <w:rPr>
+                <w:rFonts w:hint="eastAsia"/>
+              </w:rPr>
+            </w:pPr>
+            <w:r>
+              <w:rPr>
+                <w:rFonts w:ascii="宋体" w:eastAsia="宋体" w:hAnsi="宋体"/>
+                <w:sz w:val="20"/>
+              </w:rPr>
               <w:t>浏览器</w:t>
             </w:r>
           </w:p>
@@ -7081,7 +7207,7 @@
           <w:rFonts w:hint="eastAsia"/>
         </w:rPr>
       </w:pPr>
-      <w:bookmarkStart w:id="6" w:name="_Toc243685222"/>
+      <w:bookmarkStart w:id="6" w:name="_Toc243685761"/>
       <w:r>
         <w:t xml:space="preserve">2.2 </w:t>
       </w:r>
@@ -7279,7 +7405,11 @@
         <w:t>账号登录，执行建库语句：</w:t>
       </w:r>
       <w:r>
-        <w:t xml:space="preserve">CREATE DATABASE course_mgmt CHARACTER SET utf8mb4 COLLATE utf8mb4_unicode_ci; </w:t>
+        <w:t xml:space="preserve">CREATE DATABASE course_mgmt CHARACTER SET utf8mb4 </w:t>
+      </w:r>
+      <w:r>
+        <w:lastRenderedPageBreak/>
+        <w:t xml:space="preserve">COLLATE utf8mb4_unicode_ci; </w:t>
       </w:r>
       <w:r>
         <w:t>随后依次执行</w:t>
@@ -7305,7 +7435,6 @@
         </w:rPr>
       </w:pPr>
       <w:r>
-        <w:lastRenderedPageBreak/>
         <w:t>（</w:t>
       </w:r>
       <w:r>
@@ -7459,7 +7588,7 @@
           <w:rFonts w:hint="eastAsia"/>
         </w:rPr>
       </w:pPr>
-      <w:bookmarkStart w:id="7" w:name="_Toc243685223"/>
+      <w:bookmarkStart w:id="7" w:name="_Toc243685762"/>
       <w:r>
         <w:t xml:space="preserve">2.3 </w:t>
       </w:r>
@@ -7648,7 +7777,7 @@
           <w:rFonts w:hint="eastAsia"/>
         </w:rPr>
       </w:pPr>
-      <w:bookmarkStart w:id="8" w:name="_Toc243685224"/>
+      <w:bookmarkStart w:id="8" w:name="_Toc243685763"/>
       <w:r>
         <w:lastRenderedPageBreak/>
         <w:t>三．系统需求</w:t>
@@ -7703,7 +7832,7 @@
           <w:rFonts w:hint="eastAsia"/>
         </w:rPr>
       </w:pPr>
-      <w:bookmarkStart w:id="9" w:name="_Toc243685225"/>
+      <w:bookmarkStart w:id="9" w:name="_Toc243685764"/>
       <w:r>
         <w:t xml:space="preserve">3.1 </w:t>
       </w:r>
@@ -8141,7 +8270,7 @@
           <w:rFonts w:hint="eastAsia"/>
         </w:rPr>
       </w:pPr>
-      <w:bookmarkStart w:id="10" w:name="_Toc243685226"/>
+      <w:bookmarkStart w:id="10" w:name="_Toc243685765"/>
       <w:r>
         <w:t xml:space="preserve">3.2 </w:t>
       </w:r>
@@ -8318,7 +8447,7 @@
           <w:rFonts w:hint="eastAsia"/>
         </w:rPr>
       </w:pPr>
-      <w:bookmarkStart w:id="11" w:name="_Toc243685227"/>
+      <w:bookmarkStart w:id="11" w:name="_Toc243685766"/>
       <w:r>
         <w:t xml:space="preserve">3.3 </w:t>
       </w:r>
@@ -8403,7 +8532,7 @@
           <w:rFonts w:hint="eastAsia"/>
         </w:rPr>
       </w:pPr>
-      <w:bookmarkStart w:id="12" w:name="_Toc243685228"/>
+      <w:bookmarkStart w:id="12" w:name="_Toc243685767"/>
       <w:r>
         <w:t xml:space="preserve">3.4 </w:t>
       </w:r>
@@ -8615,7 +8744,7 @@
           <w:rFonts w:hint="eastAsia"/>
         </w:rPr>
       </w:pPr>
-      <w:bookmarkStart w:id="13" w:name="_Toc243685229"/>
+      <w:bookmarkStart w:id="13" w:name="_Toc243685768"/>
       <w:r>
         <w:lastRenderedPageBreak/>
         <w:t>四．系统概要设计</w:t>
@@ -8646,7 +8775,7 @@
           <w:rFonts w:hint="eastAsia"/>
         </w:rPr>
       </w:pPr>
-      <w:bookmarkStart w:id="14" w:name="_Toc243685230"/>
+      <w:bookmarkStart w:id="14" w:name="_Toc243685769"/>
       <w:r>
         <w:t xml:space="preserve">4.1 </w:t>
       </w:r>
@@ -8667,7 +8796,7 @@
           <w:noProof/>
         </w:rPr>
         <w:drawing>
-          <wp:inline distT="0" distB="0" distL="0" distR="0" wp14:anchorId="1FD46873" wp14:editId="32B7BA8D">
+          <wp:inline distT="0" distB="0" distL="0" distR="0" wp14:anchorId="472A32BF" wp14:editId="38E991B1">
             <wp:extent cx="3060000" cy="4456957"/>
             <wp:effectExtent l="0" t="0" r="0" b="0"/>
             <wp:docPr id="3" name="Picture 3"/>
@@ -8888,7 +9017,7 @@
           <w:rFonts w:hint="eastAsia"/>
         </w:rPr>
       </w:pPr>
-      <w:bookmarkStart w:id="15" w:name="_Toc243685231"/>
+      <w:bookmarkStart w:id="15" w:name="_Toc243685770"/>
       <w:r>
         <w:t xml:space="preserve">4.2 </w:t>
       </w:r>
@@ -8909,7 +9038,7 @@
           <w:noProof/>
         </w:rPr>
         <w:drawing>
-          <wp:inline distT="0" distB="0" distL="0" distR="0" wp14:anchorId="4D7C8498" wp14:editId="3CF79F19">
+          <wp:inline distT="0" distB="0" distL="0" distR="0" wp14:anchorId="73871800" wp14:editId="20B0BD00">
             <wp:extent cx="5400000" cy="4755575"/>
             <wp:effectExtent l="0" t="0" r="0" b="0"/>
             <wp:docPr id="4" name="Picture 4"/>
@@ -8986,7 +9115,7 @@
           <w:rFonts w:hint="eastAsia"/>
         </w:rPr>
       </w:pPr>
-      <w:bookmarkStart w:id="16" w:name="_Toc243685232"/>
+      <w:bookmarkStart w:id="16" w:name="_Toc243685771"/>
       <w:r>
         <w:t xml:space="preserve">4.3 </w:t>
       </w:r>
@@ -10770,7 +10899,7 @@
           <w:rFonts w:hint="eastAsia"/>
         </w:rPr>
       </w:pPr>
-      <w:bookmarkStart w:id="17" w:name="_Toc243685233"/>
+      <w:bookmarkStart w:id="17" w:name="_Toc243685772"/>
       <w:r>
         <w:t xml:space="preserve">4.4 </w:t>
       </w:r>
@@ -11790,7 +11919,7 @@
           <w:rFonts w:hint="eastAsia"/>
         </w:rPr>
       </w:pPr>
-      <w:bookmarkStart w:id="18" w:name="_Toc243685234"/>
+      <w:bookmarkStart w:id="18" w:name="_Toc243685773"/>
       <w:r>
         <w:t xml:space="preserve">4.5 </w:t>
       </w:r>
@@ -11954,7 +12083,7 @@
           <w:rFonts w:hint="eastAsia"/>
         </w:rPr>
       </w:pPr>
-      <w:bookmarkStart w:id="19" w:name="_Toc243685235"/>
+      <w:bookmarkStart w:id="19" w:name="_Toc243685774"/>
       <w:r>
         <w:lastRenderedPageBreak/>
         <w:t>五．系统</w:t>
@@ -12009,7 +12138,7 @@
           <w:rFonts w:hint="eastAsia"/>
         </w:rPr>
       </w:pPr>
-      <w:bookmarkStart w:id="20" w:name="_Toc243685236"/>
+      <w:bookmarkStart w:id="20" w:name="_Toc243685775"/>
       <w:r>
         <w:t xml:space="preserve">5.1 </w:t>
       </w:r>
@@ -12132,7 +12261,7 @@
           <w:rFonts w:hint="eastAsia"/>
         </w:rPr>
       </w:pPr>
-      <w:bookmarkStart w:id="21" w:name="_Toc243685237"/>
+      <w:bookmarkStart w:id="21" w:name="_Toc243685776"/>
       <w:r>
         <w:t xml:space="preserve">5.2 </w:t>
       </w:r>
@@ -12160,7 +12289,7 @@
         </w:rPr>
         <w:lastRenderedPageBreak/>
         <w:drawing>
-          <wp:inline distT="0" distB="0" distL="0" distR="0" wp14:anchorId="029F60CC" wp14:editId="37511600">
+          <wp:inline distT="0" distB="0" distL="0" distR="0" wp14:anchorId="374F6C5D" wp14:editId="7CFCEA92">
             <wp:extent cx="3960000" cy="5217882"/>
             <wp:effectExtent l="0" t="0" r="0" b="0"/>
             <wp:docPr id="5" name="Picture 5"/>
@@ -12255,7 +12384,7 @@
           <w:rFonts w:hint="eastAsia"/>
         </w:rPr>
       </w:pPr>
-      <w:bookmarkStart w:id="22" w:name="_Toc243685238"/>
+      <w:bookmarkStart w:id="22" w:name="_Toc243685777"/>
       <w:r>
         <w:t xml:space="preserve">5.3 </w:t>
       </w:r>
@@ -12283,7 +12412,7 @@
         </w:rPr>
         <w:lastRenderedPageBreak/>
         <w:drawing>
-          <wp:inline distT="0" distB="0" distL="0" distR="0" wp14:anchorId="3CC5D811" wp14:editId="0CFEDB65">
+          <wp:inline distT="0" distB="0" distL="0" distR="0" wp14:anchorId="0DBFEB7D" wp14:editId="16B9C50C">
             <wp:extent cx="4500000" cy="5250000"/>
             <wp:effectExtent l="0" t="0" r="0" b="0"/>
             <wp:docPr id="6" name="Picture 6"/>
@@ -12372,7 +12501,7 @@
           <w:rFonts w:hint="eastAsia"/>
         </w:rPr>
       </w:pPr>
-      <w:bookmarkStart w:id="23" w:name="_Toc243685239"/>
+      <w:bookmarkStart w:id="23" w:name="_Toc243685778"/>
       <w:r>
         <w:t xml:space="preserve">5.4 </w:t>
       </w:r>
@@ -12534,7 +12663,7 @@
           <w:rFonts w:hint="eastAsia"/>
         </w:rPr>
       </w:pPr>
-      <w:bookmarkStart w:id="24" w:name="_Toc243685240"/>
+      <w:bookmarkStart w:id="24" w:name="_Toc243685779"/>
       <w:r>
         <w:lastRenderedPageBreak/>
         <w:t>六．系统数据库设计</w:t>
@@ -12583,7 +12712,7 @@
           <w:rFonts w:hint="eastAsia"/>
         </w:rPr>
       </w:pPr>
-      <w:bookmarkStart w:id="25" w:name="_Toc243685241"/>
+      <w:bookmarkStart w:id="25" w:name="_Toc243685780"/>
       <w:r>
         <w:t xml:space="preserve">6.1 </w:t>
       </w:r>
@@ -12703,7 +12832,7 @@
           <w:rFonts w:hint="eastAsia"/>
         </w:rPr>
       </w:pPr>
-      <w:bookmarkStart w:id="26" w:name="_Toc243685242"/>
+      <w:bookmarkStart w:id="26" w:name="_Toc243685781"/>
       <w:r>
         <w:t xml:space="preserve">6.2 </w:t>
       </w:r>
@@ -14786,7 +14915,7 @@
           <w:rFonts w:hint="eastAsia"/>
         </w:rPr>
       </w:pPr>
-      <w:bookmarkStart w:id="27" w:name="_Toc243685243"/>
+      <w:bookmarkStart w:id="27" w:name="_Toc243685782"/>
       <w:r>
         <w:t xml:space="preserve">6.3 </w:t>
       </w:r>
@@ -18150,7 +18279,7 @@
           <w:rFonts w:hint="eastAsia"/>
         </w:rPr>
       </w:pPr>
-      <w:bookmarkStart w:id="28" w:name="_Toc243685244"/>
+      <w:bookmarkStart w:id="28" w:name="_Toc243685783"/>
       <w:r>
         <w:t xml:space="preserve">6.4 </w:t>
       </w:r>
@@ -21469,7 +21598,7 @@
           <w:rFonts w:hint="eastAsia"/>
         </w:rPr>
       </w:pPr>
-      <w:bookmarkStart w:id="29" w:name="_Toc243685245"/>
+      <w:bookmarkStart w:id="29" w:name="_Toc243685784"/>
       <w:r>
         <w:t xml:space="preserve">6.5 </w:t>
       </w:r>
@@ -21563,7 +21692,7 @@
           <w:rFonts w:hint="eastAsia"/>
         </w:rPr>
       </w:pPr>
-      <w:bookmarkStart w:id="30" w:name="_Toc243685246"/>
+      <w:bookmarkStart w:id="30" w:name="_Toc243685785"/>
       <w:r>
         <w:lastRenderedPageBreak/>
         <w:t>七．系统功能实现</w:t>
@@ -21618,7 +21747,7 @@
           <w:rFonts w:hint="eastAsia"/>
         </w:rPr>
       </w:pPr>
-      <w:bookmarkStart w:id="31" w:name="_Toc243685247"/>
+      <w:bookmarkStart w:id="31" w:name="_Toc243685786"/>
       <w:r>
         <w:t xml:space="preserve">7.1 </w:t>
       </w:r>
@@ -21757,7 +21886,7 @@
           <w:rFonts w:hint="eastAsia"/>
         </w:rPr>
       </w:pPr>
-      <w:bookmarkStart w:id="32" w:name="_Toc243685248"/>
+      <w:bookmarkStart w:id="32" w:name="_Toc243685787"/>
       <w:r>
         <w:t xml:space="preserve">7.2 </w:t>
       </w:r>
@@ -21801,7 +21930,7 @@
           <w:rFonts w:hint="eastAsia"/>
         </w:rPr>
       </w:pPr>
-      <w:bookmarkStart w:id="33" w:name="_Toc243685249"/>
+      <w:bookmarkStart w:id="33" w:name="_Toc243685788"/>
       <w:r>
         <w:t xml:space="preserve">7.3 </w:t>
       </w:r>
@@ -21834,7 +21963,7 @@
           <w:rFonts w:hint="eastAsia"/>
         </w:rPr>
       </w:pPr>
-      <w:bookmarkStart w:id="34" w:name="_Toc243685250"/>
+      <w:bookmarkStart w:id="34" w:name="_Toc243685789"/>
       <w:r>
         <w:lastRenderedPageBreak/>
         <w:t xml:space="preserve">7.4 </w:t>
@@ -21862,7 +21991,7 @@
           <w:rFonts w:hint="eastAsia"/>
         </w:rPr>
       </w:pPr>
-      <w:bookmarkStart w:id="35" w:name="_Toc243685251"/>
+      <w:bookmarkStart w:id="35" w:name="_Toc243685790"/>
       <w:r>
         <w:t xml:space="preserve">7.5 </w:t>
       </w:r>
@@ -21889,7 +22018,7 @@
           <w:rFonts w:hint="eastAsia"/>
         </w:rPr>
       </w:pPr>
-      <w:bookmarkStart w:id="36" w:name="_Toc243685252"/>
+      <w:bookmarkStart w:id="36" w:name="_Toc243685791"/>
       <w:r>
         <w:t xml:space="preserve">7.6 </w:t>
       </w:r>
@@ -22026,7 +22155,7 @@
           <w:rFonts w:hint="eastAsia"/>
         </w:rPr>
       </w:pPr>
-      <w:bookmarkStart w:id="37" w:name="_Toc243685253"/>
+      <w:bookmarkStart w:id="37" w:name="_Toc243685792"/>
       <w:r>
         <w:t xml:space="preserve">7.7 </w:t>
       </w:r>
@@ -22086,7 +22215,7 @@
           <w:rFonts w:hint="eastAsia"/>
         </w:rPr>
       </w:pPr>
-      <w:bookmarkStart w:id="38" w:name="_Toc243685254"/>
+      <w:bookmarkStart w:id="38" w:name="_Toc243685793"/>
       <w:r>
         <w:t xml:space="preserve">7.8 </w:t>
       </w:r>
@@ -22247,7 +22376,7 @@
           <w:rFonts w:hint="eastAsia"/>
         </w:rPr>
       </w:pPr>
-      <w:bookmarkStart w:id="39" w:name="_Toc243685255"/>
+      <w:bookmarkStart w:id="39" w:name="_Toc243685794"/>
       <w:r>
         <w:t xml:space="preserve">7.9 </w:t>
       </w:r>
@@ -22495,7 +22624,7 @@
           <w:rFonts w:hint="eastAsia"/>
         </w:rPr>
       </w:pPr>
-      <w:bookmarkStart w:id="40" w:name="_Toc243685256"/>
+      <w:bookmarkStart w:id="40" w:name="_Toc243685795"/>
       <w:r>
         <w:t xml:space="preserve">7.10 </w:t>
       </w:r>
@@ -26260,7 +26389,7 @@
           <w:rFonts w:hint="eastAsia"/>
         </w:rPr>
       </w:pPr>
-      <w:bookmarkStart w:id="41" w:name="_Toc243685257"/>
+      <w:bookmarkStart w:id="41" w:name="_Toc243685796"/>
       <w:r>
         <w:t xml:space="preserve">7.11 </w:t>
       </w:r>
@@ -26292,7 +26421,7 @@
           <w:noProof/>
         </w:rPr>
         <w:drawing>
-          <wp:inline distT="0" distB="0" distL="0" distR="0" wp14:anchorId="283375A7" wp14:editId="593557D7">
+          <wp:inline distT="0" distB="0" distL="0" distR="0" wp14:anchorId="6FC91E65" wp14:editId="119FFC02">
             <wp:extent cx="4500000" cy="2812500"/>
             <wp:effectExtent l="0" t="0" r="0" b="0"/>
             <wp:docPr id="7" name="Picture 7"/>
@@ -26358,7 +26487,7 @@
         </w:rPr>
         <w:lastRenderedPageBreak/>
         <w:drawing>
-          <wp:inline distT="0" distB="0" distL="0" distR="0" wp14:anchorId="6E77BA94" wp14:editId="023DBA0D">
+          <wp:inline distT="0" distB="0" distL="0" distR="0" wp14:anchorId="4193A12F" wp14:editId="579B545A">
             <wp:extent cx="4500000" cy="2812500"/>
             <wp:effectExtent l="0" t="0" r="0" b="0"/>
             <wp:docPr id="8" name="Picture 8"/>
@@ -26423,7 +26552,7 @@
           <w:noProof/>
         </w:rPr>
         <w:drawing>
-          <wp:inline distT="0" distB="0" distL="0" distR="0" wp14:anchorId="151748FC" wp14:editId="3957B13C">
+          <wp:inline distT="0" distB="0" distL="0" distR="0" wp14:anchorId="7CFFD716" wp14:editId="7DEB5163">
             <wp:extent cx="4500000" cy="2812500"/>
             <wp:effectExtent l="0" t="0" r="0" b="0"/>
             <wp:docPr id="9" name="Picture 9"/>
@@ -26489,7 +26618,7 @@
         </w:rPr>
         <w:lastRenderedPageBreak/>
         <w:drawing>
-          <wp:inline distT="0" distB="0" distL="0" distR="0" wp14:anchorId="7437126D" wp14:editId="7FCAD24F">
+          <wp:inline distT="0" distB="0" distL="0" distR="0" wp14:anchorId="479E4078" wp14:editId="1D1C1F07">
             <wp:extent cx="4500000" cy="2812500"/>
             <wp:effectExtent l="0" t="0" r="0" b="0"/>
             <wp:docPr id="10" name="Picture 10"/>
@@ -26554,7 +26683,7 @@
           <w:noProof/>
         </w:rPr>
         <w:drawing>
-          <wp:inline distT="0" distB="0" distL="0" distR="0" wp14:anchorId="22F32480" wp14:editId="64CC0975">
+          <wp:inline distT="0" distB="0" distL="0" distR="0" wp14:anchorId="5ADF0471" wp14:editId="38BA4608">
             <wp:extent cx="4500000" cy="2812500"/>
             <wp:effectExtent l="0" t="0" r="0" b="0"/>
             <wp:docPr id="11" name="Picture 11"/>
@@ -26620,7 +26749,7 @@
         </w:rPr>
         <w:lastRenderedPageBreak/>
         <w:drawing>
-          <wp:inline distT="0" distB="0" distL="0" distR="0" wp14:anchorId="0293A7DF" wp14:editId="759BCBBB">
+          <wp:inline distT="0" distB="0" distL="0" distR="0" wp14:anchorId="5D1D78B9" wp14:editId="4EAD268D">
             <wp:extent cx="4500000" cy="2812500"/>
             <wp:effectExtent l="0" t="0" r="0" b="0"/>
             <wp:docPr id="12" name="Picture 12"/>
@@ -26681,7 +26810,7 @@
           <w:rFonts w:hint="eastAsia"/>
         </w:rPr>
       </w:pPr>
-      <w:bookmarkStart w:id="42" w:name="_Toc243685258"/>
+      <w:bookmarkStart w:id="42" w:name="_Toc243685797"/>
       <w:r>
         <w:lastRenderedPageBreak/>
         <w:t>八．项目总结及收获</w:t>
@@ -26695,7 +26824,7 @@
           <w:rFonts w:hint="eastAsia"/>
         </w:rPr>
       </w:pPr>
-      <w:bookmarkStart w:id="43" w:name="_Toc243685259"/>
+      <w:bookmarkStart w:id="43" w:name="_Toc243685798"/>
       <w:r>
         <w:t xml:space="preserve">8.1 </w:t>
       </w:r>
@@ -26781,7 +26910,7 @@
           <w:rFonts w:hint="eastAsia"/>
         </w:rPr>
       </w:pPr>
-      <w:bookmarkStart w:id="44" w:name="_Toc243685260"/>
+      <w:bookmarkStart w:id="44" w:name="_Toc243685799"/>
       <w:r>
         <w:t xml:space="preserve">8.2 </w:t>
       </w:r>
@@ -26909,7 +27038,7 @@
           <w:rFonts w:hint="eastAsia"/>
         </w:rPr>
       </w:pPr>
-      <w:bookmarkStart w:id="45" w:name="_Toc243685261"/>
+      <w:bookmarkStart w:id="45" w:name="_Toc243685800"/>
       <w:r>
         <w:t xml:space="preserve">8.3 </w:t>
       </w:r>
@@ -27195,7 +27324,7 @@
           <w:rFonts w:hint="eastAsia"/>
         </w:rPr>
       </w:pPr>
-      <w:bookmarkStart w:id="46" w:name="_Toc243685262"/>
+      <w:bookmarkStart w:id="46" w:name="_Toc243685801"/>
       <w:r>
         <w:t xml:space="preserve">8.4 </w:t>
       </w:r>
@@ -27375,7 +27504,7 @@
           <w:rFonts w:hint="eastAsia"/>
         </w:rPr>
       </w:pPr>
-      <w:bookmarkStart w:id="47" w:name="_Toc243685263"/>
+      <w:bookmarkStart w:id="47" w:name="_Toc243685802"/>
       <w:r>
         <w:lastRenderedPageBreak/>
         <w:t>附录</w:t>
@@ -27502,7 +27631,7 @@
           <w:rFonts w:hint="eastAsia"/>
         </w:rPr>
       </w:pPr>
-      <w:bookmarkStart w:id="48" w:name="_Toc243685264"/>
+      <w:bookmarkStart w:id="48" w:name="_Toc243685803"/>
       <w:r>
         <w:lastRenderedPageBreak/>
         <w:t>附录</w:t>
@@ -28532,7 +28661,7 @@
           <w:rFonts w:hint="eastAsia"/>
         </w:rPr>
       </w:pPr>
-      <w:bookmarkStart w:id="49" w:name="_Toc243685265"/>
+      <w:bookmarkStart w:id="49" w:name="_Toc243685804"/>
       <w:r>
         <w:lastRenderedPageBreak/>
         <w:t>附录</w:t>
@@ -28694,7 +28823,7 @@
           <w:rFonts w:hint="eastAsia"/>
         </w:rPr>
       </w:pPr>
-      <w:bookmarkStart w:id="50" w:name="_Toc243685266"/>
+      <w:bookmarkStart w:id="50" w:name="_Toc243685805"/>
       <w:r>
         <w:lastRenderedPageBreak/>
         <w:t>参考文献</w:t>
@@ -28764,7 +28893,7 @@
           <w:rFonts w:hint="eastAsia"/>
         </w:rPr>
       </w:pPr>
-      <w:bookmarkStart w:id="51" w:name="_Toc243685267"/>
+      <w:bookmarkStart w:id="51" w:name="_Toc243685806"/>
       <w:r>
         <w:lastRenderedPageBreak/>
         <w:t>附录</w:t>
@@ -29800,7 +29929,7 @@
     <w:autoRedefine/>
     <w:uiPriority w:val="39"/>
     <w:unhideWhenUsed/>
-    <w:rsid w:val="00B954D1"/>
+    <w:rsid w:val="00B243AE"/>
   </w:style>
   <w:style w:type="paragraph" w:styleId="TOC2">
     <w:name w:val="toc 2"/>
@@ -29809,7 +29938,7 @@
     <w:autoRedefine/>
     <w:uiPriority w:val="39"/>
     <w:unhideWhenUsed/>
-    <w:rsid w:val="00B954D1"/>
+    <w:rsid w:val="00B243AE"/>
     <w:pPr>
       <w:ind w:leftChars="200" w:left="420"/>
     </w:pPr>
@@ -29820,7 +29949,7 @@
     <w:link w:val="a5"/>
     <w:uiPriority w:val="99"/>
     <w:unhideWhenUsed/>
-    <w:rsid w:val="00B954D1"/>
+    <w:rsid w:val="00B243AE"/>
     <w:pPr>
       <w:tabs>
         <w:tab w:val="center" w:pos="4153"/>
@@ -29839,7 +29968,7 @@
     <w:basedOn w:val="a0"/>
     <w:link w:val="a4"/>
     <w:uiPriority w:val="99"/>
-    <w:rsid w:val="00B954D1"/>
+    <w:rsid w:val="00B243AE"/>
     <w:rPr>
       <w:kern w:val="2"/>
       <w:sz w:val="18"/>
@@ -29852,7 +29981,7 @@
     <w:link w:val="a7"/>
     <w:uiPriority w:val="99"/>
     <w:unhideWhenUsed/>
-    <w:rsid w:val="00B954D1"/>
+    <w:rsid w:val="00B243AE"/>
     <w:pPr>
       <w:tabs>
         <w:tab w:val="center" w:pos="4153"/>
@@ -29871,7 +30000,7 @@
     <w:basedOn w:val="a0"/>
     <w:link w:val="a6"/>
     <w:uiPriority w:val="99"/>
-    <w:rsid w:val="00B954D1"/>
+    <w:rsid w:val="00B243AE"/>
     <w:rPr>
       <w:kern w:val="2"/>
       <w:sz w:val="18"/>

</xml_diff>